<commit_message>
docs: PRD_and_Agents.md are engineered
</commit_message>
<xml_diff>
--- a/Core Layer-Defines why the system exists/01 - Constitution.docx
+++ b/Core Layer-Defines why the system exists/01 - Constitution.docx
@@ -2567,7 +2567,7 @@
     <w:p>
       <w:r>
         <w:pict w14:anchorId="3F5455D8">
-          <v:rect id="_x0000_i1073" style="width:0;height:1.5pt" o:hralign="center" o:hrstd="t" o:hr="t" fillcolor="#a0a0a0" stroked="f"/>
+          <v:rect id="_x0000_i1049" style="width:0;height:1.5pt" o:hralign="center" o:hrstd="t" o:hr="t" fillcolor="#a0a0a0" stroked="f"/>
         </w:pict>
       </w:r>
     </w:p>
@@ -2590,7 +2590,7 @@
     <w:p>
       <w:r>
         <w:pict w14:anchorId="216E0FCB">
-          <v:rect id="_x0000_i1074" style="width:0;height:1.5pt" o:hralign="center" o:hrstd="t" o:hr="t" fillcolor="#a0a0a0" stroked="f"/>
+          <v:rect id="_x0000_i1050" style="width:0;height:1.5pt" o:hralign="center" o:hrstd="t" o:hr="t" fillcolor="#a0a0a0" stroked="f"/>
         </w:pict>
       </w:r>
     </w:p>
@@ -2621,7 +2621,7 @@
     <w:p>
       <w:r>
         <w:pict w14:anchorId="1660ADCC">
-          <v:rect id="_x0000_i1075" style="width:0;height:1.5pt" o:hralign="center" o:hrstd="t" o:hr="t" fillcolor="#a0a0a0" stroked="f"/>
+          <v:rect id="_x0000_i1051" style="width:0;height:1.5pt" o:hralign="center" o:hrstd="t" o:hr="t" fillcolor="#a0a0a0" stroked="f"/>
         </w:pict>
       </w:r>
     </w:p>
@@ -2650,9 +2650,29 @@
       </w:r>
     </w:p>
     <w:p>
+      <w:pPr>
+        <w:pStyle w:val="NormalWeb"/>
+      </w:pPr>
+      <w:r>
+        <w:rPr>
+          <w:b/>
+          <w:bCs/>
+        </w:rPr>
+        <w:t>CL-22A — Scenario Continuity</w:t>
+      </w:r>
+    </w:p>
+    <w:p>
+      <w:pPr>
+        <w:pStyle w:val="NormalWeb"/>
+      </w:pPr>
+      <w:r>
+        <w:t>Once a scenario successfully establishes the dominant mental model, subsequent explanations, examples, visuals, and exercises SHOULD continue using the same scenario unless a deliberate transfer stage is being introduced.</w:t>
+      </w:r>
+    </w:p>
+    <w:p>
       <w:r>
         <w:pict w14:anchorId="15F836CA">
-          <v:rect id="_x0000_i1076" style="width:0;height:1.5pt" o:hralign="center" o:hrstd="t" o:hr="t" fillcolor="#a0a0a0" stroked="f"/>
+          <v:rect id="_x0000_i1052" style="width:0;height:1.5pt" o:hralign="center" o:hrstd="t" o:hr="t" fillcolor="#a0a0a0" stroked="f"/>
         </w:pict>
       </w:r>
     </w:p>
@@ -2682,8 +2702,9 @@
     </w:p>
     <w:p>
       <w:r>
+        <w:lastRenderedPageBreak/>
         <w:pict w14:anchorId="6E5AA864">
-          <v:rect id="_x0000_i1077" style="width:0;height:1.5pt" o:hralign="center" o:hrstd="t" o:hr="t" fillcolor="#a0a0a0" stroked="f"/>
+          <v:rect id="_x0000_i1053" style="width:0;height:1.5pt" o:hralign="center" o:hrstd="t" o:hr="t" fillcolor="#a0a0a0" stroked="f"/>
         </w:pict>
       </w:r>
     </w:p>
@@ -2705,9 +2726,148 @@
     </w:p>
     <w:p>
       <w:r>
+        <w:pict w14:anchorId="26FAE955">
+          <v:rect id="_x0000_i1054" style="width:0;height:1.5pt" o:hralign="center" o:hrstd="t" o:hr="t" fillcolor="#a0a0a0" stroked="f"/>
+        </w:pict>
+      </w:r>
+    </w:p>
+    <w:p>
+      <w:pPr>
+        <w:pStyle w:val="Heading2"/>
+      </w:pPr>
+      <w:r>
+        <w:t>CL-25 — Practice Reinforces Understanding</w:t>
+      </w:r>
+    </w:p>
+    <w:p>
+      <w:pPr>
+        <w:pStyle w:val="NormalWeb"/>
+      </w:pPr>
+      <w:r>
+        <w:t>Every educational episode SHOULD provide an opportunity for the learner to apply or mentally test the concept being taught.</w:t>
+      </w:r>
+    </w:p>
+    <w:p>
+      <w:pPr>
+        <w:pStyle w:val="NormalWeb"/>
+      </w:pPr>
+      <w:r>
+        <w:t>Learning is strengthened through active engagement rather than passive observation.</w:t>
+      </w:r>
+    </w:p>
+    <w:p>
+      <w:r>
+        <w:pict w14:anchorId="02D63607">
+          <v:rect id="_x0000_i1055" style="width:0;height:1.5pt" o:hralign="center" o:hrstd="t" o:hr="t" fillcolor="#a0a0a0" stroked="f"/>
+        </w:pict>
+      </w:r>
+    </w:p>
+    <w:p>
+      <w:pPr>
+        <w:pStyle w:val="Heading1"/>
+      </w:pPr>
+      <w:r>
+        <w:t>7. Ethical Laws</w:t>
+      </w:r>
+    </w:p>
+    <w:p>
+      <w:pPr>
+        <w:pStyle w:val="NormalWeb"/>
+      </w:pPr>
+      <w:r>
+        <w:t>The following laws govern the ethical use of CKLIS.</w:t>
+      </w:r>
+    </w:p>
+    <w:p>
+      <w:r>
+        <w:pict w14:anchorId="6EE35D58">
+          <v:rect id="_x0000_i1056" style="width:0;height:1.5pt" o:hralign="center" o:hrstd="t" o:hr="t" fillcolor="#a0a0a0" stroked="f"/>
+        </w:pict>
+      </w:r>
+    </w:p>
+    <w:p>
+      <w:pPr>
+        <w:pStyle w:val="Heading2"/>
+      </w:pPr>
+      <w:r>
+        <w:t>CL-26 — Respect for Cultures</w:t>
+      </w:r>
+    </w:p>
+    <w:p>
+      <w:pPr>
+        <w:pStyle w:val="NormalWeb"/>
+      </w:pPr>
+      <w:r>
+        <w:t>Educational scenarios MUST treat cultures, traditions, histories, and communities with respect.</w:t>
+      </w:r>
+    </w:p>
+    <w:p>
+      <w:pPr>
+        <w:pStyle w:val="NormalWeb"/>
+      </w:pPr>
+      <w:r>
+        <w:t>Cultural references exist to improve understanding, not to stereotype or mock.</w:t>
+      </w:r>
+    </w:p>
+    <w:p>
+      <w:r>
+        <w:pict w14:anchorId="2380D8A8">
+          <v:rect id="_x0000_i1057" style="width:0;height:1.5pt" o:hralign="center" o:hrstd="t" o:hr="t" fillcolor="#a0a0a0" stroked="f"/>
+        </w:pict>
+      </w:r>
+    </w:p>
+    <w:p>
+      <w:pPr>
+        <w:pStyle w:val="Heading2"/>
+      </w:pPr>
+      <w:r>
+        <w:t>CL-27 — Inclusive Learning</w:t>
+      </w:r>
+    </w:p>
+    <w:p>
+      <w:pPr>
+        <w:pStyle w:val="NormalWeb"/>
+      </w:pPr>
+      <w:r>
+        <w:t>Examples SHOULD be broadly understandable and avoid unnecessary exclusion based on geography, language, gender, age, or background.</w:t>
+      </w:r>
+    </w:p>
+    <w:p>
+      <w:r>
+        <w:pict w14:anchorId="21046DCA">
+          <v:rect id="_x0000_i1058" style="width:0;height:1.5pt" o:hralign="center" o:hrstd="t" o:hr="t" fillcolor="#a0a0a0" stroked="f"/>
+        </w:pict>
+      </w:r>
+    </w:p>
+    <w:p>
+      <w:pPr>
+        <w:pStyle w:val="Heading2"/>
+      </w:pPr>
+      <w:r>
+        <w:t>CL-28 — Honest Communication</w:t>
+      </w:r>
+    </w:p>
+    <w:p>
+      <w:pPr>
+        <w:pStyle w:val="NormalWeb"/>
+      </w:pPr>
+      <w:r>
+        <w:t>CKLIS implementations MUST distinguish between verified facts, educational simplifications, and hypothetical examples.</w:t>
+      </w:r>
+    </w:p>
+    <w:p>
+      <w:pPr>
+        <w:pStyle w:val="NormalWeb"/>
+      </w:pPr>
+      <w:r>
+        <w:t>The learner should never be intentionally misled for dramatic effect.</w:t>
+      </w:r>
+    </w:p>
+    <w:p>
+      <w:r>
         <w:lastRenderedPageBreak/>
-        <w:pict w14:anchorId="26FAE955">
-          <v:rect id="_x0000_i1078" style="width:0;height:1.5pt" o:hralign="center" o:hrstd="t" o:hr="t" fillcolor="#a0a0a0" stroked="f"/>
+        <w:pict w14:anchorId="41F4A02C">
+          <v:rect id="_x0000_i1059" style="width:0;height:1.5pt" o:hralign="center" o:hrstd="t" o:hr="t" fillcolor="#a0a0a0" stroked="f"/>
         </w:pict>
       </w:r>
     </w:p>
@@ -2716,29 +2876,52 @@
         <w:pStyle w:val="Heading2"/>
       </w:pPr>
       <w:r>
-        <w:t>CL-25 — Practice Reinforces Understanding</w:t>
-      </w:r>
-    </w:p>
-    <w:p>
-      <w:pPr>
-        <w:pStyle w:val="NormalWeb"/>
-      </w:pPr>
-      <w:r>
-        <w:t>Every educational episode SHOULD provide an opportunity for the learner to apply or mentally test the concept being taught.</w:t>
-      </w:r>
-    </w:p>
-    <w:p>
-      <w:pPr>
-        <w:pStyle w:val="NormalWeb"/>
-      </w:pPr>
-      <w:r>
-        <w:t>Learning is strengthened through active engagement rather than passive observation.</w:t>
-      </w:r>
-    </w:p>
-    <w:p>
-      <w:r>
-        <w:pict w14:anchorId="02D63607">
-          <v:rect id="_x0000_i1079" style="width:0;height:1.5pt" o:hralign="center" o:hrstd="t" o:hr="t" fillcolor="#a0a0a0" stroked="f"/>
+        <w:t>CL-29 — Attribution of Ideas</w:t>
+      </w:r>
+    </w:p>
+    <w:p>
+      <w:pPr>
+        <w:pStyle w:val="NormalWeb"/>
+      </w:pPr>
+      <w:r>
+        <w:t>When educational content is derived from identifiable external work, appropriate attribution SHOULD be provided where practical and applicable.</w:t>
+      </w:r>
+    </w:p>
+    <w:p>
+      <w:r>
+        <w:pict w14:anchorId="60B17DE4">
+          <v:rect id="_x0000_i1060" style="width:0;height:1.5pt" o:hralign="center" o:hrstd="t" o:hr="t" fillcolor="#a0a0a0" stroked="f"/>
+        </w:pict>
+      </w:r>
+    </w:p>
+    <w:p>
+      <w:pPr>
+        <w:pStyle w:val="Heading2"/>
+      </w:pPr>
+      <w:r>
+        <w:t>CL-30 — Responsible AI Use</w:t>
+      </w:r>
+    </w:p>
+    <w:p>
+      <w:pPr>
+        <w:pStyle w:val="NormalWeb"/>
+      </w:pPr>
+      <w:r>
+        <w:t>AI-generated educational material SHOULD be reviewed appropriately before publication when accuracy is important.</w:t>
+      </w:r>
+    </w:p>
+    <w:p>
+      <w:pPr>
+        <w:pStyle w:val="NormalWeb"/>
+      </w:pPr>
+      <w:r>
+        <w:t>CKLIS assists educational creation; it does not eliminate responsibility for educational quality.</w:t>
+      </w:r>
+    </w:p>
+    <w:p>
+      <w:r>
+        <w:pict w14:anchorId="14377FBA">
+          <v:rect id="_x0000_i1061" style="width:0;height:1.5pt" o:hralign="center" o:hrstd="t" o:hr="t" fillcolor="#a0a0a0" stroked="f"/>
         </w:pict>
       </w:r>
     </w:p>
@@ -2747,21 +2930,21 @@
         <w:pStyle w:val="Heading1"/>
       </w:pPr>
       <w:r>
-        <w:t>7. Ethical Laws</w:t>
-      </w:r>
-    </w:p>
-    <w:p>
-      <w:pPr>
-        <w:pStyle w:val="NormalWeb"/>
-      </w:pPr>
-      <w:r>
-        <w:t>The following laws govern the ethical use of CKLIS.</w:t>
-      </w:r>
-    </w:p>
-    <w:p>
-      <w:r>
-        <w:pict w14:anchorId="6EE35D58">
-          <v:rect id="_x0000_i1080" style="width:0;height:1.5pt" o:hralign="center" o:hrstd="t" o:hr="t" fillcolor="#a0a0a0" stroked="f"/>
+        <w:t>8. Prohibited Practices</w:t>
+      </w:r>
+    </w:p>
+    <w:p>
+      <w:pPr>
+        <w:pStyle w:val="NormalWeb"/>
+      </w:pPr>
+      <w:r>
+        <w:t>The following practices are prohibited within CKLIS.</w:t>
+      </w:r>
+    </w:p>
+    <w:p>
+      <w:r>
+        <w:pict w14:anchorId="302BCBA0">
+          <v:rect id="_x0000_i1062" style="width:0;height:1.5pt" o:hralign="center" o:hrstd="t" o:hr="t" fillcolor="#a0a0a0" stroked="f"/>
         </w:pict>
       </w:r>
     </w:p>
@@ -2770,29 +2953,21 @@
         <w:pStyle w:val="Heading2"/>
       </w:pPr>
       <w:r>
-        <w:t>CL-26 — Respect for Cultures</w:t>
-      </w:r>
-    </w:p>
-    <w:p>
-      <w:pPr>
-        <w:pStyle w:val="NormalWeb"/>
-      </w:pPr>
-      <w:r>
-        <w:t>Educational scenarios MUST treat cultures, traditions, histories, and communities with respect.</w:t>
-      </w:r>
-    </w:p>
-    <w:p>
-      <w:pPr>
-        <w:pStyle w:val="NormalWeb"/>
-      </w:pPr>
-      <w:r>
-        <w:t>Cultural references exist to improve understanding, not to stereotype or mock.</w:t>
-      </w:r>
-    </w:p>
-    <w:p>
-      <w:r>
-        <w:pict w14:anchorId="2380D8A8">
-          <v:rect id="_x0000_i1081" style="width:0;height:1.5pt" o:hralign="center" o:hrstd="t" o:hr="t" fillcolor="#a0a0a0" stroked="f"/>
+        <w:t>CP-01 — Syntax-First Teaching</w:t>
+      </w:r>
+    </w:p>
+    <w:p>
+      <w:pPr>
+        <w:pStyle w:val="NormalWeb"/>
+      </w:pPr>
+      <w:r>
+        <w:t>Presenting syntax before establishing conceptual understanding as the default teaching strategy.</w:t>
+      </w:r>
+    </w:p>
+    <w:p>
+      <w:r>
+        <w:pict w14:anchorId="1B2F96CA">
+          <v:rect id="_x0000_i1063" style="width:0;height:1.5pt" o:hralign="center" o:hrstd="t" o:hr="t" fillcolor="#a0a0a0" stroked="f"/>
         </w:pict>
       </w:r>
     </w:p>
@@ -2801,21 +2976,21 @@
         <w:pStyle w:val="Heading2"/>
       </w:pPr>
       <w:r>
-        <w:t>CL-27 — Inclusive Learning</w:t>
-      </w:r>
-    </w:p>
-    <w:p>
-      <w:pPr>
-        <w:pStyle w:val="NormalWeb"/>
-      </w:pPr>
-      <w:r>
-        <w:t>Examples SHOULD be broadly understandable and avoid unnecessary exclusion based on geography, language, gender, age, or background.</w:t>
-      </w:r>
-    </w:p>
-    <w:p>
-      <w:r>
-        <w:pict w14:anchorId="21046DCA">
-          <v:rect id="_x0000_i1082" style="width:0;height:1.5pt" o:hralign="center" o:hrstd="t" o:hr="t" fillcolor="#a0a0a0" stroked="f"/>
+        <w:t>CP-02 — Forced Analogies</w:t>
+      </w:r>
+    </w:p>
+    <w:p>
+      <w:pPr>
+        <w:pStyle w:val="NormalWeb"/>
+      </w:pPr>
+      <w:r>
+        <w:t>Using analogies that resemble programming terminology but fail to explain the underlying mechanism.</w:t>
+      </w:r>
+    </w:p>
+    <w:p>
+      <w:r>
+        <w:pict w14:anchorId="0BB878CF">
+          <v:rect id="_x0000_i1064" style="width:0;height:1.5pt" o:hralign="center" o:hrstd="t" o:hr="t" fillcolor="#a0a0a0" stroked="f"/>
         </w:pict>
       </w:r>
     </w:p>
@@ -2824,29 +2999,21 @@
         <w:pStyle w:val="Heading2"/>
       </w:pPr>
       <w:r>
-        <w:t>CL-28 — Honest Communication</w:t>
-      </w:r>
-    </w:p>
-    <w:p>
-      <w:pPr>
-        <w:pStyle w:val="NormalWeb"/>
-      </w:pPr>
-      <w:r>
-        <w:t>CKLIS implementations MUST distinguish between verified facts, educational simplifications, and hypothetical examples.</w:t>
-      </w:r>
-    </w:p>
-    <w:p>
-      <w:pPr>
-        <w:pStyle w:val="NormalWeb"/>
-      </w:pPr>
-      <w:r>
-        <w:t>The learner should never be intentionally misled for dramatic effect.</w:t>
-      </w:r>
-    </w:p>
-    <w:p>
-      <w:r>
-        <w:pict w14:anchorId="41F4A02C">
-          <v:rect id="_x0000_i1083" style="width:0;height:1.5pt" o:hralign="center" o:hrstd="t" o:hr="t" fillcolor="#a0a0a0" stroked="f"/>
+        <w:t>CP-03 — Entertainment Without Learning</w:t>
+      </w:r>
+    </w:p>
+    <w:p>
+      <w:pPr>
+        <w:pStyle w:val="NormalWeb"/>
+      </w:pPr>
+      <w:r>
+        <w:t>Optimizing educational content solely for engagement while reducing conceptual understanding.</w:t>
+      </w:r>
+    </w:p>
+    <w:p>
+      <w:r>
+        <w:pict w14:anchorId="3EFF643B">
+          <v:rect id="_x0000_i1065" style="width:0;height:1.5pt" o:hralign="center" o:hrstd="t" o:hr="t" fillcolor="#a0a0a0" stroked="f"/>
         </w:pict>
       </w:r>
     </w:p>
@@ -2855,22 +3022,22 @@
         <w:pStyle w:val="Heading2"/>
       </w:pPr>
       <w:r>
-        <w:t>CL-29 — Attribution of Ideas</w:t>
-      </w:r>
-    </w:p>
-    <w:p>
-      <w:pPr>
-        <w:pStyle w:val="NormalWeb"/>
-      </w:pPr>
-      <w:r>
-        <w:t>When educational content is derived from identifiable external work, appropriate attribution SHOULD be provided where practical and applicable.</w:t>
-      </w:r>
-    </w:p>
-    <w:p>
-      <w:r>
         <w:lastRenderedPageBreak/>
-        <w:pict w14:anchorId="60B17DE4">
-          <v:rect id="_x0000_i1084" style="width:0;height:1.5pt" o:hralign="center" o:hrstd="t" o:hr="t" fillcolor="#a0a0a0" stroked="f"/>
+        <w:t>CP-04 — Multiple Unrelated Objectives</w:t>
+      </w:r>
+    </w:p>
+    <w:p>
+      <w:pPr>
+        <w:pStyle w:val="NormalWeb"/>
+      </w:pPr>
+      <w:r>
+        <w:t>Attempting to teach several unrelated primary concepts within a single educational episode.</w:t>
+      </w:r>
+    </w:p>
+    <w:p>
+      <w:r>
+        <w:pict w14:anchorId="66B50CC3">
+          <v:rect id="_x0000_i1066" style="width:0;height:1.5pt" o:hralign="center" o:hrstd="t" o:hr="t" fillcolor="#a0a0a0" stroked="f"/>
         </w:pict>
       </w:r>
     </w:p>
@@ -2879,52 +3046,21 @@
         <w:pStyle w:val="Heading2"/>
       </w:pPr>
       <w:r>
-        <w:t>CL-30 — Responsible AI Use</w:t>
-      </w:r>
-    </w:p>
-    <w:p>
-      <w:pPr>
-        <w:pStyle w:val="NormalWeb"/>
-      </w:pPr>
-      <w:r>
-        <w:t>AI-generated educational material SHOULD be reviewed appropriately before publication when accuracy is important.</w:t>
-      </w:r>
-    </w:p>
-    <w:p>
-      <w:pPr>
-        <w:pStyle w:val="NormalWeb"/>
-      </w:pPr>
-      <w:r>
-        <w:t>CKLIS assists educational creation; it does not eliminate responsibility for educational quality.</w:t>
-      </w:r>
-    </w:p>
-    <w:p>
-      <w:r>
-        <w:pict w14:anchorId="14377FBA">
-          <v:rect id="_x0000_i1085" style="width:0;height:1.5pt" o:hralign="center" o:hrstd="t" o:hr="t" fillcolor="#a0a0a0" stroked="f"/>
-        </w:pict>
-      </w:r>
-    </w:p>
-    <w:p>
-      <w:pPr>
-        <w:pStyle w:val="Heading1"/>
-      </w:pPr>
-      <w:r>
-        <w:t>8. Prohibited Practices</w:t>
-      </w:r>
-    </w:p>
-    <w:p>
-      <w:pPr>
-        <w:pStyle w:val="NormalWeb"/>
-      </w:pPr>
-      <w:r>
-        <w:t>The following practices are prohibited within CKLIS.</w:t>
-      </w:r>
-    </w:p>
-    <w:p>
-      <w:r>
-        <w:pict w14:anchorId="302BCBA0">
-          <v:rect id="_x0000_i1086" style="width:0;height:1.5pt" o:hralign="center" o:hrstd="t" o:hr="t" fillcolor="#a0a0a0" stroked="f"/>
+        <w:t>CP-05 — Incorrect Simplification</w:t>
+      </w:r>
+    </w:p>
+    <w:p>
+      <w:pPr>
+        <w:pStyle w:val="NormalWeb"/>
+      </w:pPr>
+      <w:r>
+        <w:t>Simplifying a programming concept in a way that creates an incorrect mental model.</w:t>
+      </w:r>
+    </w:p>
+    <w:p>
+      <w:r>
+        <w:pict w14:anchorId="4AB7932B">
+          <v:rect id="_x0000_i1067" style="width:0;height:1.5pt" o:hralign="center" o:hrstd="t" o:hr="t" fillcolor="#a0a0a0" stroked="f"/>
         </w:pict>
       </w:r>
     </w:p>
@@ -2933,21 +3069,21 @@
         <w:pStyle w:val="Heading2"/>
       </w:pPr>
       <w:r>
-        <w:t>CP-01 — Syntax-First Teaching</w:t>
-      </w:r>
-    </w:p>
-    <w:p>
-      <w:pPr>
-        <w:pStyle w:val="NormalWeb"/>
-      </w:pPr>
-      <w:r>
-        <w:t>Presenting syntax before establishing conceptual understanding as the default teaching strategy.</w:t>
-      </w:r>
-    </w:p>
-    <w:p>
-      <w:r>
-        <w:pict w14:anchorId="1B2F96CA">
-          <v:rect id="_x0000_i1087" style="width:0;height:1.5pt" o:hralign="center" o:hrstd="t" o:hr="t" fillcolor="#a0a0a0" stroked="f"/>
+        <w:t>CP-06 — Hidden Assumptions</w:t>
+      </w:r>
+    </w:p>
+    <w:p>
+      <w:pPr>
+        <w:pStyle w:val="NormalWeb"/>
+      </w:pPr>
+      <w:r>
+        <w:t>Assuming prerequisite knowledge without making those assumptions explicit.</w:t>
+      </w:r>
+    </w:p>
+    <w:p>
+      <w:r>
+        <w:pict w14:anchorId="7F95BBE6">
+          <v:rect id="_x0000_i1068" style="width:0;height:1.5pt" o:hralign="center" o:hrstd="t" o:hr="t" fillcolor="#a0a0a0" stroked="f"/>
         </w:pict>
       </w:r>
     </w:p>
@@ -2956,21 +3092,21 @@
         <w:pStyle w:val="Heading2"/>
       </w:pPr>
       <w:r>
-        <w:t>CP-02 — Forced Analogies</w:t>
-      </w:r>
-    </w:p>
-    <w:p>
-      <w:pPr>
-        <w:pStyle w:val="NormalWeb"/>
-      </w:pPr>
-      <w:r>
-        <w:t>Using analogies that resemble programming terminology but fail to explain the underlying mechanism.</w:t>
-      </w:r>
-    </w:p>
-    <w:p>
-      <w:r>
-        <w:pict w14:anchorId="0BB878CF">
-          <v:rect id="_x0000_i1088" style="width:0;height:1.5pt" o:hralign="center" o:hrstd="t" o:hr="t" fillcolor="#a0a0a0" stroked="f"/>
+        <w:t>CP-07 — AI Hallucination Presented as Fact</w:t>
+      </w:r>
+    </w:p>
+    <w:p>
+      <w:pPr>
+        <w:pStyle w:val="NormalWeb"/>
+      </w:pPr>
+      <w:r>
+        <w:t>Presenting uncertain or fabricated technical information as verified educational knowledge.</w:t>
+      </w:r>
+    </w:p>
+    <w:p>
+      <w:r>
+        <w:pict w14:anchorId="2E565A3F">
+          <v:rect id="_x0000_i1069" style="width:0;height:1.5pt" o:hralign="center" o:hrstd="t" o:hr="t" fillcolor="#a0a0a0" stroked="f"/>
         </w:pict>
       </w:r>
     </w:p>
@@ -2979,122 +3115,6 @@
         <w:pStyle w:val="Heading2"/>
       </w:pPr>
       <w:r>
-        <w:t>CP-03 — Entertainment Without Learning</w:t>
-      </w:r>
-    </w:p>
-    <w:p>
-      <w:pPr>
-        <w:pStyle w:val="NormalWeb"/>
-      </w:pPr>
-      <w:r>
-        <w:t>Optimizing educational content solely for engagement while reducing conceptual understanding.</w:t>
-      </w:r>
-    </w:p>
-    <w:p>
-      <w:r>
-        <w:pict w14:anchorId="3EFF643B">
-          <v:rect id="_x0000_i1089" style="width:0;height:1.5pt" o:hralign="center" o:hrstd="t" o:hr="t" fillcolor="#a0a0a0" stroked="f"/>
-        </w:pict>
-      </w:r>
-    </w:p>
-    <w:p>
-      <w:pPr>
-        <w:pStyle w:val="Heading2"/>
-      </w:pPr>
-      <w:r>
-        <w:t>CP-04 — Multiple Unrelated Objectives</w:t>
-      </w:r>
-    </w:p>
-    <w:p>
-      <w:pPr>
-        <w:pStyle w:val="NormalWeb"/>
-      </w:pPr>
-      <w:r>
-        <w:t>Attempting to teach several unrelated primary concepts within a single educational episode.</w:t>
-      </w:r>
-    </w:p>
-    <w:p>
-      <w:r>
-        <w:pict w14:anchorId="66B50CC3">
-          <v:rect id="_x0000_i1090" style="width:0;height:1.5pt" o:hralign="center" o:hrstd="t" o:hr="t" fillcolor="#a0a0a0" stroked="f"/>
-        </w:pict>
-      </w:r>
-    </w:p>
-    <w:p>
-      <w:pPr>
-        <w:pStyle w:val="Heading2"/>
-      </w:pPr>
-      <w:r>
-        <w:t>CP-05 — Incorrect Simplification</w:t>
-      </w:r>
-    </w:p>
-    <w:p>
-      <w:pPr>
-        <w:pStyle w:val="NormalWeb"/>
-      </w:pPr>
-      <w:r>
-        <w:lastRenderedPageBreak/>
-        <w:t>Simplifying a programming concept in a way that creates an incorrect mental model.</w:t>
-      </w:r>
-    </w:p>
-    <w:p>
-      <w:r>
-        <w:pict w14:anchorId="4AB7932B">
-          <v:rect id="_x0000_i1091" style="width:0;height:1.5pt" o:hralign="center" o:hrstd="t" o:hr="t" fillcolor="#a0a0a0" stroked="f"/>
-        </w:pict>
-      </w:r>
-    </w:p>
-    <w:p>
-      <w:pPr>
-        <w:pStyle w:val="Heading2"/>
-      </w:pPr>
-      <w:r>
-        <w:t>CP-06 — Hidden Assumptions</w:t>
-      </w:r>
-    </w:p>
-    <w:p>
-      <w:pPr>
-        <w:pStyle w:val="NormalWeb"/>
-      </w:pPr>
-      <w:r>
-        <w:t>Assuming prerequisite knowledge without making those assumptions explicit.</w:t>
-      </w:r>
-    </w:p>
-    <w:p>
-      <w:r>
-        <w:pict w14:anchorId="7F95BBE6">
-          <v:rect id="_x0000_i1092" style="width:0;height:1.5pt" o:hralign="center" o:hrstd="t" o:hr="t" fillcolor="#a0a0a0" stroked="f"/>
-        </w:pict>
-      </w:r>
-    </w:p>
-    <w:p>
-      <w:pPr>
-        <w:pStyle w:val="Heading2"/>
-      </w:pPr>
-      <w:r>
-        <w:t>CP-07 — AI Hallucination Presented as Fact</w:t>
-      </w:r>
-    </w:p>
-    <w:p>
-      <w:pPr>
-        <w:pStyle w:val="NormalWeb"/>
-      </w:pPr>
-      <w:r>
-        <w:t>Presenting uncertain or fabricated technical information as verified educational knowledge.</w:t>
-      </w:r>
-    </w:p>
-    <w:p>
-      <w:r>
-        <w:pict w14:anchorId="2E565A3F">
-          <v:rect id="_x0000_i1093" style="width:0;height:1.5pt" o:hralign="center" o:hrstd="t" o:hr="t" fillcolor="#a0a0a0" stroked="f"/>
-        </w:pict>
-      </w:r>
-    </w:p>
-    <w:p>
-      <w:pPr>
-        <w:pStyle w:val="Heading2"/>
-      </w:pPr>
-      <w:r>
         <w:t>CP-08 — Cultural Exploitation</w:t>
       </w:r>
     </w:p>
@@ -3117,7 +3137,7 @@
     <w:p>
       <w:r>
         <w:pict w14:anchorId="41D0E7BF">
-          <v:rect id="_x0000_i1094" style="width:0;height:1.5pt" o:hralign="center" o:hrstd="t" o:hr="t" fillcolor="#a0a0a0" stroked="f"/>
+          <v:rect id="_x0000_i1070" style="width:0;height:1.5pt" o:hralign="center" o:hrstd="t" o:hr="t" fillcolor="#a0a0a0" stroked="f"/>
         </w:pict>
       </w:r>
     </w:p>
@@ -3204,7 +3224,7 @@
     <w:p>
       <w:r>
         <w:pict w14:anchorId="06576175">
-          <v:rect id="_x0000_i1095" style="width:0;height:1.5pt" o:hralign="center" o:hrstd="t" o:hr="t" fillcolor="#a0a0a0" stroked="f"/>
+          <v:rect id="_x0000_i1071" style="width:0;height:1.5pt" o:hralign="center" o:hrstd="t" o:hr="t" fillcolor="#a0a0a0" stroked="f"/>
         </w:pict>
       </w:r>
     </w:p>
@@ -3213,6 +3233,7 @@
         <w:pStyle w:val="Heading1"/>
       </w:pPr>
       <w:r>
+        <w:lastRenderedPageBreak/>
         <w:t>10. Constitutional Oath</w:t>
       </w:r>
     </w:p>
@@ -3245,7 +3266,6 @@
         <w:pStyle w:val="NormalWeb"/>
       </w:pPr>
       <w:r>
-        <w:lastRenderedPageBreak/>
         <w:t>We explain mechanisms before implementations.</w:t>
       </w:r>
     </w:p>
@@ -3276,7 +3296,7 @@
     <w:p>
       <w:r>
         <w:pict w14:anchorId="61427B87">
-          <v:rect id="_x0000_i1096" style="width:0;height:1.5pt" o:hralign="center" o:hrstd="t" o:hr="t" fillcolor="#a0a0a0" stroked="f"/>
+          <v:rect id="_x0000_i1072" style="width:0;height:1.5pt" o:hralign="center" o:hrstd="t" o:hr="t" fillcolor="#a0a0a0" stroked="f"/>
         </w:pict>
       </w:r>
     </w:p>
@@ -3315,7 +3335,7 @@
     <w:p>
       <w:r>
         <w:pict w14:anchorId="4E89C275">
-          <v:rect id="_x0000_i1097" style="width:0;height:1.5pt" o:hralign="center" o:hrstd="t" o:hr="t" fillcolor="#a0a0a0" stroked="f"/>
+          <v:rect id="_x0000_i1073" style="width:0;height:1.5pt" o:hralign="center" o:hrstd="t" o:hr="t" fillcolor="#a0a0a0" stroked="f"/>
         </w:pict>
       </w:r>
     </w:p>
@@ -3994,7 +4014,6 @@
   <w:style w:type="character" w:default="1" w:styleId="DefaultParagraphFont">
     <w:name w:val="Default Paragraph Font"/>
     <w:uiPriority w:val="1"/>
-    <w:semiHidden/>
     <w:unhideWhenUsed/>
   </w:style>
   <w:style w:type="table" w:default="1" w:styleId="TableNormal">

</xml_diff>